<commit_message>
refactor: organizar la app por capas (views, services, components) y agregar vista MLOps
</commit_message>
<xml_diff>
--- a/docs/DOCUMENTACION.docx
+++ b/docs/DOCUMENTACION.docx
@@ -747,7 +747,7 @@
               <w:rPr>
                 <w:sz w:val="17"/>
               </w:rPr>
-              <w:t>Pruebas automáticas (37 pruebas)</w:t>
+              <w:t>Pruebas automáticas (39 pruebas)</w:t>
             </w:r>
           </w:p>
         </w:tc>
@@ -4304,15 +4304,8 @@
       </w:r>
     </w:p>
     <w:p>
-      <w:r/>
       <w:r>
-        <w:rPr>
-          <w:rFonts w:ascii="Consolas" w:hAnsi="Consolas"/>
-        </w:rPr>
-        <w:t>app.py</w:t>
-      </w:r>
-      <w:r>
-        <w:t xml:space="preserve"> es una aplicación Streamlit de cinco páginas, ordenadas según la rúbrica de presentación:</w:t>
+        <w:t>Aplicación Streamlit organizada en capas, con una vista por fase del proyecto:</w:t>
       </w:r>
     </w:p>
     <w:tbl>
@@ -4322,13 +4315,14 @@
         <w:tblLook w:firstColumn="1" w:firstRow="1" w:lastColumn="0" w:lastRow="0" w:noHBand="0" w:noVBand="1" w:val="04A0"/>
       </w:tblPr>
       <w:tblGrid>
-        <w:gridCol w:w="4873"/>
-        <w:gridCol w:w="4873"/>
+        <w:gridCol w:w="3249"/>
+        <w:gridCol w:w="3249"/>
+        <w:gridCol w:w="3249"/>
       </w:tblGrid>
       <w:tr>
         <w:tc>
           <w:tcPr>
-            <w:tcW w:type="dxa" w:w="4873"/>
+            <w:tcW w:type="dxa" w:w="3249"/>
           </w:tcPr>
           <w:p>
             <w:r>
@@ -4342,13 +4336,13 @@
                 <w:b/>
                 <w:sz w:val="17"/>
               </w:rPr>
-              <w:t>Página</w:t>
+              <w:t>Archivo</w:t>
             </w:r>
           </w:p>
         </w:tc>
         <w:tc>
           <w:tcPr>
-            <w:tcW w:type="dxa" w:w="4873"/>
+            <w:tcW w:type="dxa" w:w="3249"/>
           </w:tcPr>
           <w:p>
             <w:r>
@@ -4362,7 +4356,27 @@
                 <w:b/>
                 <w:sz w:val="17"/>
               </w:rPr>
-              <w:t>Contenido</w:t>
+              <w:t>Capa</w:t>
+            </w:r>
+          </w:p>
+        </w:tc>
+        <w:tc>
+          <w:tcPr>
+            <w:tcW w:type="dxa" w:w="3249"/>
+          </w:tcPr>
+          <w:p>
+            <w:r>
+              <w:rPr>
+                <w:b/>
+                <w:sz w:val="17"/>
+              </w:rPr>
+            </w:r>
+            <w:r>
+              <w:rPr>
+                <w:b/>
+                <w:sz w:val="17"/>
+              </w:rPr>
+              <w:t>Qué hace</w:t>
             </w:r>
           </w:p>
         </w:tc>
@@ -4370,7 +4384,7 @@
       <w:tr>
         <w:tc>
           <w:tcPr>
-            <w:tcW w:type="dxa" w:w="4873"/>
+            <w:tcW w:type="dxa" w:w="3249"/>
           </w:tcPr>
           <w:p>
             <w:r>
@@ -4382,13 +4396,24 @@
               <w:rPr>
                 <w:sz w:val="17"/>
               </w:rPr>
-              <w:t>1 · Problema y pregunta</w:t>
+            </w:r>
+            <w:r>
+              <w:rPr>
+                <w:rFonts w:ascii="Consolas" w:hAnsi="Consolas"/>
+                <w:sz w:val="17"/>
+              </w:rPr>
+              <w:t>app.py</w:t>
+            </w:r>
+            <w:r>
+              <w:rPr>
+                <w:sz w:val="17"/>
+              </w:rPr>
             </w:r>
           </w:p>
         </w:tc>
         <w:tc>
           <w:tcPr>
-            <w:tcW w:type="dxa" w:w="4873"/>
+            <w:tcW w:type="dxa" w:w="3249"/>
           </w:tcPr>
           <w:p>
             <w:r>
@@ -4400,7 +4425,25 @@
               <w:rPr>
                 <w:sz w:val="17"/>
               </w:rPr>
-              <w:t>Pregunta central, preguntas de investigación y cifras clave</w:t>
+              <w:t>Entrada</w:t>
+            </w:r>
+          </w:p>
+        </w:tc>
+        <w:tc>
+          <w:tcPr>
+            <w:tcW w:type="dxa" w:w="3249"/>
+          </w:tcPr>
+          <w:p>
+            <w:r>
+              <w:rPr>
+                <w:sz w:val="17"/>
+              </w:rPr>
+            </w:r>
+            <w:r>
+              <w:rPr>
+                <w:sz w:val="17"/>
+              </w:rPr>
+              <w:t>Configura la página y arma el menú de navegación entre vistas</w:t>
             </w:r>
           </w:p>
         </w:tc>
@@ -4408,7 +4451,7 @@
       <w:tr>
         <w:tc>
           <w:tcPr>
-            <w:tcW w:type="dxa" w:w="4873"/>
+            <w:tcW w:type="dxa" w:w="3249"/>
           </w:tcPr>
           <w:p>
             <w:r>
@@ -4420,13 +4463,24 @@
               <w:rPr>
                 <w:sz w:val="17"/>
               </w:rPr>
-              <w:t>2 · Los datos</w:t>
+            </w:r>
+            <w:r>
+              <w:rPr>
+                <w:rFonts w:ascii="Consolas" w:hAnsi="Consolas"/>
+                <w:sz w:val="17"/>
+              </w:rPr>
+              <w:t>components.py</w:t>
+            </w:r>
+            <w:r>
+              <w:rPr>
+                <w:sz w:val="17"/>
+              </w:rPr>
             </w:r>
           </w:p>
         </w:tc>
         <w:tc>
           <w:tcPr>
-            <w:tcW w:type="dxa" w:w="4873"/>
+            <w:tcW w:type="dxa" w:w="3249"/>
           </w:tcPr>
           <w:p>
             <w:r>
@@ -4438,7 +4492,25 @@
               <w:rPr>
                 <w:sz w:val="17"/>
               </w:rPr>
-              <w:t>Fuentes, periodo de estudio y mapa de cobertura</w:t>
+              <w:t>Interfaz</w:t>
+            </w:r>
+          </w:p>
+        </w:tc>
+        <w:tc>
+          <w:tcPr>
+            <w:tcW w:type="dxa" w:w="3249"/>
+          </w:tcPr>
+          <w:p>
+            <w:r>
+              <w:rPr>
+                <w:sz w:val="17"/>
+              </w:rPr>
+            </w:r>
+            <w:r>
+              <w:rPr>
+                <w:sz w:val="17"/>
+              </w:rPr>
+              <w:t>Componentes reutilizables: encabezado de fase, caja "¿Por qué?" y figuras</w:t>
             </w:r>
           </w:p>
         </w:tc>
@@ -4446,7 +4518,7 @@
       <w:tr>
         <w:tc>
           <w:tcPr>
-            <w:tcW w:type="dxa" w:w="4873"/>
+            <w:tcW w:type="dxa" w:w="3249"/>
           </w:tcPr>
           <w:p>
             <w:r>
@@ -4458,13 +4530,24 @@
               <w:rPr>
                 <w:sz w:val="17"/>
               </w:rPr>
-              <w:t>3 · Preparación</w:t>
+            </w:r>
+            <w:r>
+              <w:rPr>
+                <w:rFonts w:ascii="Consolas" w:hAnsi="Consolas"/>
+                <w:sz w:val="17"/>
+              </w:rPr>
+              <w:t>services/pipeline.py</w:t>
+            </w:r>
+            <w:r>
+              <w:rPr>
+                <w:sz w:val="17"/>
+              </w:rPr>
             </w:r>
           </w:p>
         </w:tc>
         <w:tc>
           <w:tcPr>
-            <w:tcW w:type="dxa" w:w="4873"/>
+            <w:tcW w:type="dxa" w:w="3249"/>
           </w:tcPr>
           <w:p>
             <w:r>
@@ -4476,7 +4559,25 @@
               <w:rPr>
                 <w:sz w:val="17"/>
               </w:rPr>
-              <w:t>Decisiones del ETL con su justificación; R² lineal vs. logaritmo</w:t>
+              <w:t>Datos</w:t>
+            </w:r>
+          </w:p>
+        </w:tc>
+        <w:tc>
+          <w:tcPr>
+            <w:tcW w:type="dxa" w:w="3249"/>
+          </w:tcPr>
+          <w:p>
+            <w:r>
+              <w:rPr>
+                <w:sz w:val="17"/>
+              </w:rPr>
+            </w:r>
+            <w:r>
+              <w:rPr>
+                <w:sz w:val="17"/>
+              </w:rPr>
+              <w:t>Carga del panel, tablas, resúmenes, hashes y conteo de pruebas, con caché</w:t>
             </w:r>
           </w:p>
         </w:tc>
@@ -4484,7 +4585,7 @@
       <w:tr>
         <w:tc>
           <w:tcPr>
-            <w:tcW w:type="dxa" w:w="4873"/>
+            <w:tcW w:type="dxa" w:w="3249"/>
           </w:tcPr>
           <w:p>
             <w:r>
@@ -4496,13 +4597,24 @@
               <w:rPr>
                 <w:sz w:val="17"/>
               </w:rPr>
-              <w:t>4 · Análisis y hallazgos</w:t>
+            </w:r>
+            <w:r>
+              <w:rPr>
+                <w:rFonts w:ascii="Consolas" w:hAnsi="Consolas"/>
+                <w:sz w:val="17"/>
+              </w:rPr>
+              <w:t>views/home.py</w:t>
+            </w:r>
+            <w:r>
+              <w:rPr>
+                <w:sz w:val="17"/>
+              </w:rPr>
             </w:r>
           </w:p>
         </w:tc>
         <w:tc>
           <w:tcPr>
-            <w:tcW w:type="dxa" w:w="4873"/>
+            <w:tcW w:type="dxa" w:w="3249"/>
           </w:tcPr>
           <w:p>
             <w:r>
@@ -4514,7 +4626,25 @@
               <w:rPr>
                 <w:sz w:val="17"/>
               </w:rPr>
-              <w:t>Explorador interactivo por año y país, modelos, validación, sobre-desempeño y convergencia</w:t>
+              <w:t>Vista</w:t>
+            </w:r>
+          </w:p>
+        </w:tc>
+        <w:tc>
+          <w:tcPr>
+            <w:tcW w:type="dxa" w:w="3249"/>
+          </w:tcPr>
+          <w:p>
+            <w:r>
+              <w:rPr>
+                <w:sz w:val="17"/>
+              </w:rPr>
+            </w:r>
+            <w:r>
+              <w:rPr>
+                <w:sz w:val="17"/>
+              </w:rPr>
+              <w:t>Inicio: pregunta central, cifras clave y respuesta corta</w:t>
             </w:r>
           </w:p>
         </w:tc>
@@ -4522,7 +4652,7 @@
       <w:tr>
         <w:tc>
           <w:tcPr>
-            <w:tcW w:type="dxa" w:w="4873"/>
+            <w:tcW w:type="dxa" w:w="3249"/>
           </w:tcPr>
           <w:p>
             <w:r>
@@ -4534,13 +4664,24 @@
               <w:rPr>
                 <w:sz w:val="17"/>
               </w:rPr>
-              <w:t>5 · Conclusiones</w:t>
+            </w:r>
+            <w:r>
+              <w:rPr>
+                <w:rFonts w:ascii="Consolas" w:hAnsi="Consolas"/>
+                <w:sz w:val="17"/>
+              </w:rPr>
+              <w:t>views/mineria.py</w:t>
+            </w:r>
+            <w:r>
+              <w:rPr>
+                <w:sz w:val="17"/>
+              </w:rPr>
             </w:r>
           </w:p>
         </w:tc>
         <w:tc>
           <w:tcPr>
-            <w:tcW w:type="dxa" w:w="4873"/>
+            <w:tcW w:type="dxa" w:w="3249"/>
           </w:tcPr>
           <w:p>
             <w:r>
@@ -4552,7 +4693,293 @@
               <w:rPr>
                 <w:sz w:val="17"/>
               </w:rPr>
-              <w:t>Hipótesis, recomendación y limitaciones</w:t>
+              <w:t>Vista</w:t>
+            </w:r>
+          </w:p>
+        </w:tc>
+        <w:tc>
+          <w:tcPr>
+            <w:tcW w:type="dxa" w:w="3249"/>
+          </w:tcPr>
+          <w:p>
+            <w:r>
+              <w:rPr>
+                <w:sz w:val="17"/>
+              </w:rPr>
+            </w:r>
+            <w:r>
+              <w:rPr>
+                <w:sz w:val="17"/>
+              </w:rPr>
+              <w:t>Fuentes, justificación de los datos y cobertura por región</w:t>
+            </w:r>
+          </w:p>
+        </w:tc>
+      </w:tr>
+      <w:tr>
+        <w:tc>
+          <w:tcPr>
+            <w:tcW w:type="dxa" w:w="3249"/>
+          </w:tcPr>
+          <w:p>
+            <w:r>
+              <w:rPr>
+                <w:sz w:val="17"/>
+              </w:rPr>
+            </w:r>
+            <w:r>
+              <w:rPr>
+                <w:sz w:val="17"/>
+              </w:rPr>
+            </w:r>
+            <w:r>
+              <w:rPr>
+                <w:rFonts w:ascii="Consolas" w:hAnsi="Consolas"/>
+                <w:sz w:val="17"/>
+              </w:rPr>
+              <w:t>views/ingenieria.py</w:t>
+            </w:r>
+            <w:r>
+              <w:rPr>
+                <w:sz w:val="17"/>
+              </w:rPr>
+            </w:r>
+          </w:p>
+        </w:tc>
+        <w:tc>
+          <w:tcPr>
+            <w:tcW w:type="dxa" w:w="3249"/>
+          </w:tcPr>
+          <w:p>
+            <w:r>
+              <w:rPr>
+                <w:sz w:val="17"/>
+              </w:rPr>
+            </w:r>
+            <w:r>
+              <w:rPr>
+                <w:sz w:val="17"/>
+              </w:rPr>
+              <w:t>Vista</w:t>
+            </w:r>
+          </w:p>
+        </w:tc>
+        <w:tc>
+          <w:tcPr>
+            <w:tcW w:type="dxa" w:w="3249"/>
+          </w:tcPr>
+          <w:p>
+            <w:r>
+              <w:rPr>
+                <w:sz w:val="17"/>
+              </w:rPr>
+            </w:r>
+            <w:r>
+              <w:rPr>
+                <w:sz w:val="17"/>
+              </w:rPr>
+              <w:t>Pipeline ETL, decisiones de limpieza, panel y almacén DuckDB</w:t>
+            </w:r>
+          </w:p>
+        </w:tc>
+      </w:tr>
+      <w:tr>
+        <w:tc>
+          <w:tcPr>
+            <w:tcW w:type="dxa" w:w="3249"/>
+          </w:tcPr>
+          <w:p>
+            <w:r>
+              <w:rPr>
+                <w:sz w:val="17"/>
+              </w:rPr>
+            </w:r>
+            <w:r>
+              <w:rPr>
+                <w:sz w:val="17"/>
+              </w:rPr>
+            </w:r>
+            <w:r>
+              <w:rPr>
+                <w:rFonts w:ascii="Consolas" w:hAnsi="Consolas"/>
+                <w:sz w:val="17"/>
+              </w:rPr>
+              <w:t>views/analisis.py</w:t>
+            </w:r>
+            <w:r>
+              <w:rPr>
+                <w:sz w:val="17"/>
+              </w:rPr>
+            </w:r>
+          </w:p>
+        </w:tc>
+        <w:tc>
+          <w:tcPr>
+            <w:tcW w:type="dxa" w:w="3249"/>
+          </w:tcPr>
+          <w:p>
+            <w:r>
+              <w:rPr>
+                <w:sz w:val="17"/>
+              </w:rPr>
+            </w:r>
+            <w:r>
+              <w:rPr>
+                <w:sz w:val="17"/>
+              </w:rPr>
+              <w:t>Vista</w:t>
+            </w:r>
+          </w:p>
+        </w:tc>
+        <w:tc>
+          <w:tcPr>
+            <w:tcW w:type="dxa" w:w="3249"/>
+          </w:tcPr>
+          <w:p>
+            <w:r>
+              <w:rPr>
+                <w:sz w:val="17"/>
+              </w:rPr>
+            </w:r>
+            <w:r>
+              <w:rPr>
+                <w:sz w:val="17"/>
+              </w:rPr>
+              <w:t>Explorador interactivo, log vs. niveles, correlaciones y convergencia</w:t>
+            </w:r>
+          </w:p>
+        </w:tc>
+      </w:tr>
+      <w:tr>
+        <w:tc>
+          <w:tcPr>
+            <w:tcW w:type="dxa" w:w="3249"/>
+          </w:tcPr>
+          <w:p>
+            <w:r>
+              <w:rPr>
+                <w:sz w:val="17"/>
+              </w:rPr>
+            </w:r>
+            <w:r>
+              <w:rPr>
+                <w:sz w:val="17"/>
+              </w:rPr>
+            </w:r>
+            <w:r>
+              <w:rPr>
+                <w:rFonts w:ascii="Consolas" w:hAnsi="Consolas"/>
+                <w:sz w:val="17"/>
+              </w:rPr>
+              <w:t>views/ciencia.py</w:t>
+            </w:r>
+            <w:r>
+              <w:rPr>
+                <w:sz w:val="17"/>
+              </w:rPr>
+            </w:r>
+          </w:p>
+        </w:tc>
+        <w:tc>
+          <w:tcPr>
+            <w:tcW w:type="dxa" w:w="3249"/>
+          </w:tcPr>
+          <w:p>
+            <w:r>
+              <w:rPr>
+                <w:sz w:val="17"/>
+              </w:rPr>
+            </w:r>
+            <w:r>
+              <w:rPr>
+                <w:sz w:val="17"/>
+              </w:rPr>
+              <w:t>Vista</w:t>
+            </w:r>
+          </w:p>
+        </w:tc>
+        <w:tc>
+          <w:tcPr>
+            <w:tcW w:type="dxa" w:w="3249"/>
+          </w:tcPr>
+          <w:p>
+            <w:r>
+              <w:rPr>
+                <w:sz w:val="17"/>
+              </w:rPr>
+            </w:r>
+            <w:r>
+              <w:rPr>
+                <w:sz w:val="17"/>
+              </w:rPr>
+              <w:t>Modelos M0–M6, validación, sobre-desempeño, hipótesis y conclusiones</w:t>
+            </w:r>
+          </w:p>
+        </w:tc>
+      </w:tr>
+      <w:tr>
+        <w:tc>
+          <w:tcPr>
+            <w:tcW w:type="dxa" w:w="3249"/>
+          </w:tcPr>
+          <w:p>
+            <w:r>
+              <w:rPr>
+                <w:sz w:val="17"/>
+              </w:rPr>
+            </w:r>
+            <w:r>
+              <w:rPr>
+                <w:sz w:val="17"/>
+              </w:rPr>
+            </w:r>
+            <w:r>
+              <w:rPr>
+                <w:rFonts w:ascii="Consolas" w:hAnsi="Consolas"/>
+                <w:sz w:val="17"/>
+              </w:rPr>
+              <w:t>views/mlops.py</w:t>
+            </w:r>
+            <w:r>
+              <w:rPr>
+                <w:sz w:val="17"/>
+              </w:rPr>
+            </w:r>
+          </w:p>
+        </w:tc>
+        <w:tc>
+          <w:tcPr>
+            <w:tcW w:type="dxa" w:w="3249"/>
+          </w:tcPr>
+          <w:p>
+            <w:r>
+              <w:rPr>
+                <w:sz w:val="17"/>
+              </w:rPr>
+            </w:r>
+            <w:r>
+              <w:rPr>
+                <w:sz w:val="17"/>
+              </w:rPr>
+              <w:t>Vista</w:t>
+            </w:r>
+          </w:p>
+        </w:tc>
+        <w:tc>
+          <w:tcPr>
+            <w:tcW w:type="dxa" w:w="3249"/>
+          </w:tcPr>
+          <w:p>
+            <w:r>
+              <w:rPr>
+                <w:sz w:val="17"/>
+              </w:rPr>
+            </w:r>
+            <w:r>
+              <w:rPr>
+                <w:sz w:val="17"/>
+              </w:rPr>
+              <w:t>Pipeline reproducible, versionado de datos (SHA-256), pruebas, monitoreo y despliegue</w:t>
             </w:r>
           </w:p>
         </w:tc>
@@ -4586,7 +5013,16 @@
         <w:pStyle w:val="ListBullet"/>
       </w:pPr>
       <w:r>
-        <w:t xml:space="preserve">Usa </w:t>
+        <w:t xml:space="preserve">Las vistas no leen archivos: todo pasa por </w:t>
+      </w:r>
+      <w:r>
+        <w:rPr>
+          <w:rFonts w:ascii="Consolas" w:hAnsi="Consolas"/>
+        </w:rPr>
+        <w:t>services/pipeline.py</w:t>
+      </w:r>
+      <w:r>
+        <w:t xml:space="preserve">, que usa </w:t>
       </w:r>
       <w:r>
         <w:rPr>
@@ -4596,6 +5032,23 @@
       </w:r>
       <w:r>
         <w:t xml:space="preserve"> para leer cada archivo una sola vez.</w:t>
+      </w:r>
+    </w:p>
+    <w:p>
+      <w:pPr>
+        <w:pStyle w:val="ListBullet"/>
+      </w:pPr>
+      <w:r>
+        <w:t xml:space="preserve">Se ejecuta en local con </w:t>
+      </w:r>
+      <w:r>
+        <w:rPr>
+          <w:rFonts w:ascii="Consolas" w:hAnsi="Consolas"/>
+        </w:rPr>
+        <w:t>python -m streamlit run 06_despliegue/app.py</w:t>
+      </w:r>
+      <w:r>
+        <w:t xml:space="preserve"> (http://localhost:8501).</w:t>
       </w:r>
     </w:p>
     <w:p>
@@ -6774,7 +7227,7 @@
     </w:p>
     <w:p>
       <w:r>
-        <w:t>37 pruebas con pytest (</w:t>
+        <w:t>39 pruebas con pytest (</w:t>
       </w:r>
       <w:r>
         <w:rPr>
@@ -7104,7 +7557,7 @@
               <w:rPr>
                 <w:sz w:val="17"/>
               </w:rPr>
-              <w:t>5</w:t>
+              <w:t>7</w:t>
             </w:r>
           </w:p>
         </w:tc>
@@ -7122,7 +7575,7 @@
               <w:rPr>
                 <w:sz w:val="17"/>
               </w:rPr>
-              <w:t>Cada página de la aplicación web se ejecuta sin errores</w:t>
+              <w:t>Cada una de las 6 vistas y la app completa se ejecutan sin errores</w:t>
             </w:r>
           </w:p>
         </w:tc>

</xml_diff>